<commit_message>
feat(dao): DPAO-T adapte au premier DAO de travaux reel — pieces administratives saisies, periode de reference, montants et delais par lot
Nouveau sort de trou « adapte » (texte fixe d'un exemple que le document type invite a adapter, remplace par un jeton,
trace). 6.2 2° : la liste de six pieces imprimee d'office devient {{B03-CQ-01}} ; 6.3 4° et b : « trois (5) dernieres
annees » (coquille ARMP) -> {{B03-QT-12.lettres}} ({{B03-QT-12}}) ; 6.3 d : « < par exemple >ans » imprime tel quel,
retire ; B03-QT-08, B05-GQ-03 (sections GARANTIE-LOTS / -UNIQUE) et B09-DL-01 en .parLot (valeur seule tant que le
champ n'est pas saisi par lot). Fidelite 247/247. Banc : DPAO-T 29/30, Q10 tenu ; sous bruit, une ou deux fausses
valeurs moyennes ou basses de plus sur le paragraphe fait du seul jeton {{B03-CQ-01}}.

Co-Authored-By: Claude Opus 5.5 (1M context) <noreply@anthropic.com>
</commit_message>
<xml_diff>
--- a/docs/modeles-dao/DPAO-T.docx
+++ b/docs/modeles-dao/DPAO-T.docx
@@ -855,47 +855,7 @@
               <w:rPr>
                 <w:sz w:val="20"/>
               </w:rPr>
-              <w:t>une photocopie certifiée de la Carte Professionnelle de l’année en cours</w:t>
-            </w:r>
-          </w:p>
-          <w:p>
-            <w:r>
-              <w:rPr>
-                <w:sz w:val="20"/>
-              </w:rPr>
-              <w:t>une photocopie certifiée de l’Etat 211 bis datée de moins de TROIS (03) mois</w:t>
-            </w:r>
-          </w:p>
-          <w:p>
-            <w:r>
-              <w:rPr>
-                <w:sz w:val="20"/>
-              </w:rPr>
-              <w:t>une photocopie certifiée de l’Extrait du Registre de Commerce</w:t>
-            </w:r>
-          </w:p>
-          <w:p>
-            <w:r>
-              <w:rPr>
-                <w:sz w:val="20"/>
-              </w:rPr>
-              <w:t>un certificat de non faillite datée de moins de 2 mois</w:t>
-            </w:r>
-          </w:p>
-          <w:p>
-            <w:r>
-              <w:rPr>
-                <w:sz w:val="20"/>
-              </w:rPr>
-              <w:t>une photocopie certifiée du Numéro d’Identification Fiscale (NIF) »</w:t>
-            </w:r>
-          </w:p>
-          <w:p>
-            <w:r>
-              <w:rPr>
-                <w:sz w:val="20"/>
-              </w:rPr>
-              <w:t>une photocopie certifiée de la carte statistique</w:t>
+              <w:t>{{B03-CQ-01}}</w:t>
             </w:r>
           </w:p>
           <w:p>
@@ -1011,7 +971,7 @@
               <w:rPr>
                 <w:sz w:val="20"/>
               </w:rPr>
-              <w:t>4°la liste des principaux marchés portant sur des travaux de même type ou d'un type similaire réalisés au cours des trois dernières années</w:t>
+              <w:t>4°la liste des principaux marchés portant sur des travaux de même type ou d'un type similaire réalisés au cours des {{B03-QT-12.lettres}} dernières années</w:t>
             </w:r>
           </w:p>
           <w:p>
@@ -1103,15 +1063,15 @@
               <w:rPr>
                 <w:sz w:val="20"/>
               </w:rPr>
-              <w:t>b) avoir réalisé avec succès en tant qu’entrepreneur principal au moins un projet de nature et de complexité comparables à celles des Travaux au cours des trois (5) dernières années et comprenant:</w:t>
-            </w:r>
-          </w:p>
-          <w:p>
-            <w:r>
-              <w:rPr>
-                <w:sz w:val="20"/>
-              </w:rPr>
-              <w:t>{{B03-QT-08}}</w:t>
+              <w:t>b) avoir réalisé avec succès en tant qu’entrepreneur principal au moins un projet de nature et de complexité comparables à celles des Travaux au cours des {{B03-QT-12.lettres}} ({{B03-QT-12}}) dernières années et comprenant:</w:t>
+            </w:r>
+          </w:p>
+          <w:p>
+            <w:r>
+              <w:rPr>
+                <w:sz w:val="20"/>
+              </w:rPr>
+              <w:t>{{B03-QT-08.parLot}}</w:t>
             </w:r>
           </w:p>
           <w:p>
@@ -1135,7 +1095,7 @@
               <w:rPr>
                 <w:sz w:val="20"/>
               </w:rPr>
-              <w:t>(d) proposer un directeur de travaux ayant {{B03-QT-10}} ans d’expérience dans la réalisation de travaux de nature et de complexité comparables, y compris au moins &lt; par exemple &gt;ans d’expérience en tant que directeur;</w:t>
+              <w:t>(d) proposer un directeur de travaux ayant {{B03-QT-10}} ans d’expérience dans la réalisation de travaux de nature et de complexité comparables;</w:t>
             </w:r>
           </w:p>
           <w:p>
@@ -1751,6 +1711,38 @@
               <w:rPr>
                 <w:sz w:val="20"/>
               </w:rPr>
+              <w:t>{{SI:GARANTIE-LOTS}}</w:t>
+            </w:r>
+          </w:p>
+          <w:p>
+            <w:r>
+              <w:rPr>
+                <w:sz w:val="20"/>
+              </w:rPr>
+              <w:t>{{B05-GQ-03.parLot}}.</w:t>
+            </w:r>
+          </w:p>
+          <w:p>
+            <w:r>
+              <w:rPr>
+                <w:sz w:val="20"/>
+              </w:rPr>
+              <w:t>{{FINSI:GARANTIE-LOTS}}</w:t>
+            </w:r>
+          </w:p>
+          <w:p>
+            <w:r>
+              <w:rPr>
+                <w:sz w:val="20"/>
+              </w:rPr>
+              <w:t>{{SI:GARANTIE-UNIQUE}}</w:t>
+            </w:r>
+          </w:p>
+          <w:p>
+            <w:r>
+              <w:rPr>
+                <w:sz w:val="20"/>
+              </w:rPr>
               <w:t>{{B05-GQ-03.lettres}} ({{B05-GQ-03}}).</w:t>
             </w:r>
           </w:p>
@@ -1759,6 +1751,14 @@
               <w:rPr>
                 <w:sz w:val="20"/>
               </w:rPr>
+              <w:t>{{FINSI:GARANTIE-UNIQUE}}</w:t>
+            </w:r>
+          </w:p>
+          <w:p>
+            <w:r>
+              <w:rPr>
+                <w:sz w:val="20"/>
+              </w:rPr>
               <w:t>{{FINSI:GARANTIE}}</w:t>
             </w:r>
           </w:p>
@@ -2623,7 +2623,7 @@
               <w:rPr>
                 <w:sz w:val="20"/>
               </w:rPr>
-              <w:t>Le délai d’exécution proposé ne doit pas dépasser {{B09-DL-01}} à compter du lendemain de la date de notification de l’OS de commencer les travaux</w:t>
+              <w:t>Le délai d’exécution proposé ne doit pas dépasser {{B09-DL-01.parLot}} à compter du lendemain de la date de notification de l’OS de commencer les travaux</w:t>
             </w:r>
           </w:p>
           <w:p>

</xml_diff>

<commit_message>
feat(dao): DPAO-T — personnel cle (B03-QT-13) et liquidite par lot (B03-QT-14) imprimes sous condition, avant la livraison backend
Deux paragraphes declares en ajouts sous « Qualifications particulieres requises » : (e) personnel cle, (f) liquidite
ou ligne de credit, {{B03-QT-14.parLot}} ; conditions PERSONNEL-CLE / LIQUIDITE (renseigne), fausses tant que les
champs ne sont pas servis. Fidelite 253/253. Banc : DPAO-T 31/32, Q10 tenu (propre, graines 3, 6, 11). Demande du
01/10 mise a jour en place (B1, B2.1).

Co-Authored-By: Claude Opus 5.5 (1M context) <noreply@anthropic.com>
</commit_message>
<xml_diff>
--- a/docs/modeles-dao/DPAO-T.docx
+++ b/docs/modeles-dao/DPAO-T.docx
@@ -1103,6 +1103,54 @@
               <w:rPr>
                 <w:sz w:val="20"/>
               </w:rPr>
+              <w:t>{{SI:PERSONNEL-CLE}}</w:t>
+            </w:r>
+          </w:p>
+          <w:p>
+            <w:r>
+              <w:rPr>
+                <w:sz w:val="20"/>
+              </w:rPr>
+              <w:t>(e) proposer le personnel clé suivant : {{B03-QT-13}}</w:t>
+            </w:r>
+          </w:p>
+          <w:p>
+            <w:r>
+              <w:rPr>
+                <w:sz w:val="20"/>
+              </w:rPr>
+              <w:t>{{FINSI:PERSONNEL-CLE}}</w:t>
+            </w:r>
+          </w:p>
+          <w:p>
+            <w:r>
+              <w:rPr>
+                <w:sz w:val="20"/>
+              </w:rPr>
+              <w:t>{{SI:LIQUIDITE}}</w:t>
+            </w:r>
+          </w:p>
+          <w:p>
+            <w:r>
+              <w:rPr>
+                <w:sz w:val="20"/>
+              </w:rPr>
+              <w:t>(f) justifier d’une liquidité ou d’une ligne de crédit délivrée par une banque primaire, d’un montant minimum de : {{B03-QT-14.parLot}}</w:t>
+            </w:r>
+          </w:p>
+          <w:p>
+            <w:r>
+              <w:rPr>
+                <w:sz w:val="20"/>
+              </w:rPr>
+              <w:t>{{FINSI:LIQUIDITE}}</w:t>
+            </w:r>
+          </w:p>
+          <w:p>
+            <w:r>
+              <w:rPr>
+                <w:sz w:val="20"/>
+              </w:rPr>
               <w:t>{{SI:QUALIFICATIONS}}</w:t>
             </w:r>
           </w:p>

</xml_diff>

<commit_message>
feat(dao): DPAO-T apres livraison backend — formes de garantie en « contient », limite de lots (B02-AU-07), offres anormales (B06-EO-07)
1.1 : la phrase du document type « mais ne peut pretendre qu'a ….lots » (retiree le 29/09 faute de champ) imprime
B02-AU-07 en lettres et en chiffres ; 6.7 : GARANTIE-BANCAIRE / -CAUTION / -CHEQUE passent a `B05-GQ-02 contient`
(LISTE_MULTIPLE servie) ; 9.4.5 : rangee declaree pour B06-EO-07. Fidelite 260/260, 40 conditions.

Co-Authored-By: Claude Opus 5.5 (1M context) <noreply@anthropic.com>
</commit_message>
<xml_diff>
--- a/docs/modeles-dao/DPAO-T.docx
+++ b/docs/modeles-dao/DPAO-T.docx
@@ -267,6 +267,30 @@
               <w:rPr>
                 <w:sz w:val="20"/>
               </w:rPr>
+              <w:t>{{SI:LIMITE-LOTS}}</w:t>
+            </w:r>
+          </w:p>
+          <w:p>
+            <w:r>
+              <w:rPr>
+                <w:sz w:val="20"/>
+              </w:rPr>
+              <w:t>mais ne peut prétendre qu’à {{B02-AU-07.lettres}} ({{B02-AU-07}}) lots</w:t>
+            </w:r>
+          </w:p>
+          <w:p>
+            <w:r>
+              <w:rPr>
+                <w:sz w:val="20"/>
+              </w:rPr>
+              <w:t>{{FINSI:LIMITE-LOTS}}</w:t>
+            </w:r>
+          </w:p>
+          <w:p>
+            <w:r>
+              <w:rPr>
+                <w:sz w:val="20"/>
+              </w:rPr>
               <w:t>{{SI:LOTS-TOTALITE}}</w:t>
             </w:r>
           </w:p>
@@ -2555,6 +2579,90 @@
                 <w:sz w:val="20"/>
               </w:rPr>
               <w:t>{{FINSI:ALLOTI}}</w:t>
+            </w:r>
+          </w:p>
+        </w:tc>
+        <w:tc>
+          <w:tcPr>
+            <w:tcW w:type="pct" w:w="2500"/>
+          </w:tcPr>
+          <w:p>
+            <w:r>
+              <w:rPr>
+                <w:sz w:val="20"/>
+              </w:rPr>
+              <w:t/>
+            </w:r>
+          </w:p>
+        </w:tc>
+      </w:tr>
+      <w:tr>
+        <w:tc>
+          <w:tcPr>
+            <w:tcW w:type="pct" w:w="2500"/>
+          </w:tcPr>
+          <w:p>
+            <w:r>
+              <w:rPr>
+                <w:sz w:val="20"/>
+              </w:rPr>
+              <w:t>{{SI:OFFRES-ANORMALES}}</w:t>
+            </w:r>
+          </w:p>
+        </w:tc>
+        <w:tc>
+          <w:tcPr>
+            <w:tcW w:type="pct" w:w="2500"/>
+          </w:tcPr>
+          <w:p>
+            <w:r>
+              <w:rPr>
+                <w:sz w:val="20"/>
+              </w:rPr>
+              <w:t/>
+            </w:r>
+          </w:p>
+        </w:tc>
+      </w:tr>
+      <w:tr>
+        <w:tc>
+          <w:tcPr>
+            <w:tcW w:type="pct" w:w="2500"/>
+          </w:tcPr>
+          <w:p>
+            <w:r>
+              <w:rPr>
+                <w:sz w:val="20"/>
+              </w:rPr>
+              <w:t>9.4.5. Offres anormalement basses ou anormalement hautes</w:t>
+            </w:r>
+          </w:p>
+        </w:tc>
+        <w:tc>
+          <w:tcPr>
+            <w:tcW w:type="pct" w:w="2500"/>
+          </w:tcPr>
+          <w:p>
+            <w:r>
+              <w:rPr>
+                <w:sz w:val="20"/>
+              </w:rPr>
+              <w:t>{{B06-EO-07}}</w:t>
+            </w:r>
+          </w:p>
+        </w:tc>
+      </w:tr>
+      <w:tr>
+        <w:tc>
+          <w:tcPr>
+            <w:tcW w:type="pct" w:w="2500"/>
+          </w:tcPr>
+          <w:p>
+            <w:r>
+              <w:rPr>
+                <w:sz w:val="20"/>
+              </w:rPr>
+              <w:t>{{FINSI:OFFRES-ANORMALES}}</w:t>
             </w:r>
           </w:p>
         </w:tc>

</xml_diff>

<commit_message>
feat(modeles): CCAP-T art. 16 sur {{BESOIN.series}} ; DPAO-T 6.3 : variantes des seuils calcules (CA moyen, references cumulees, liquidite en %) en attente de validation du pilote ; DQE livre (V59) : repli « contrat en attente » retire
Co-Authored-By: Claude Opus 5.5 (1M context) <noreply@anthropic.com>
</commit_message>
<xml_diff>
--- a/docs/modeles-dao/DPAO-T.docx
+++ b/docs/modeles-dao/DPAO-T.docx
@@ -1079,7 +1079,7 @@
               <w:rPr>
                 <w:sz w:val="20"/>
               </w:rPr>
-              <w:t>a) avoir réalisé un chiffre d’affaires annuel, pour des travaux de construction, d’un montant équivalant à</w:t>
+              <w:t>a) avoir réalisé un chiffre d’affaires annuel, pour des {{B03-QT-18}}, d’un montant équivalant à</w:t>
             </w:r>
           </w:p>
           <w:p>
@@ -1103,6 +1103,38 @@
               <w:rPr>
                 <w:sz w:val="20"/>
               </w:rPr>
+              <w:t>{{SI:CA-MOYENNE}}</w:t>
+            </w:r>
+          </w:p>
+          <w:p>
+            <w:r>
+              <w:rPr>
+                <w:sz w:val="20"/>
+              </w:rPr>
+              <w:t>a) avoir réalisé un chiffre d’affaires annuel moyen, calculé sur les {{B03-QT-16.lettres}} ({{B03-QT-16}}) meilleures des {{B03-QT-17.lettres}} ({{B03-QT-17}}) dernières années, pour des {{B03-QT-18}}, d’un montant équivalant à {{B03-QT-07}}</w:t>
+            </w:r>
+          </w:p>
+          <w:p>
+            <w:r>
+              <w:rPr>
+                <w:sz w:val="20"/>
+              </w:rPr>
+              <w:t>{{FINSI:CA-MOYENNE}}</w:t>
+            </w:r>
+          </w:p>
+          <w:p>
+            <w:r>
+              <w:rPr>
+                <w:sz w:val="20"/>
+              </w:rPr>
+              <w:t>{{SI:REFERENCES-UN}}</w:t>
+            </w:r>
+          </w:p>
+          <w:p>
+            <w:r>
+              <w:rPr>
+                <w:sz w:val="20"/>
+              </w:rPr>
               <w:t>b) avoir réalisé avec succès en tant qu’entrepreneur principal au moins un projet de nature et de complexité comparables à celles des Travaux au cours des {{B03-QT-12.lettres}} ({{B03-QT-12}}) dernières années et comprenant:</w:t>
             </w:r>
           </w:p>
@@ -1111,6 +1143,38 @@
               <w:rPr>
                 <w:sz w:val="20"/>
               </w:rPr>
+              <w:t>{{FINSI:REFERENCES-UN}}</w:t>
+            </w:r>
+          </w:p>
+          <w:p>
+            <w:r>
+              <w:rPr>
+                <w:sz w:val="20"/>
+              </w:rPr>
+              <w:t>{{SI:REFERENCES-CUMUL}}</w:t>
+            </w:r>
+          </w:p>
+          <w:p>
+            <w:r>
+              <w:rPr>
+                <w:sz w:val="20"/>
+              </w:rPr>
+              <w:t>b) avoir réalisé avec succès en tant qu’entrepreneur principal, au cours des {{B03-QT-12.lettres}} ({{B03-QT-12}}) dernières années, au plus {{B03-QT-19.lettres}} ({{B03-QT-19}}) marchés de nature et de complexité comparables à celles des Travaux, d’un montant cumulé d’au moins {{B03-QT-20.parLot}}, et comprenant :</w:t>
+            </w:r>
+          </w:p>
+          <w:p>
+            <w:r>
+              <w:rPr>
+                <w:sz w:val="20"/>
+              </w:rPr>
+              <w:t>{{FINSI:REFERENCES-CUMUL}}</w:t>
+            </w:r>
+          </w:p>
+          <w:p>
+            <w:r>
+              <w:rPr>
+                <w:sz w:val="20"/>
+              </w:rPr>
               <w:t>{{B03-QT-08.parLot}}</w:t>
             </w:r>
           </w:p>
@@ -1184,6 +1248,30 @@
                 <w:sz w:val="20"/>
               </w:rPr>
               <w:t>{{FINSI:LIQUIDITE}}</w:t>
+            </w:r>
+          </w:p>
+          <w:p>
+            <w:r>
+              <w:rPr>
+                <w:sz w:val="20"/>
+              </w:rPr>
+              <w:t>{{SI:LIQUIDITE-POURCENT}}</w:t>
+            </w:r>
+          </w:p>
+          <w:p>
+            <w:r>
+              <w:rPr>
+                <w:sz w:val="20"/>
+              </w:rPr>
+              <w:t>(f) justifier d’une liquidité ou d’une ligne de crédit délivrée par une banque primaire, d’un montant minimum égal à {{B03-QT-15.parLot}} du montant de son offre</w:t>
+            </w:r>
+          </w:p>
+          <w:p>
+            <w:r>
+              <w:rPr>
+                <w:sz w:val="20"/>
+              </w:rPr>
+              <w:t>{{FINSI:LIQUIDITE-POURCENT}}</w:t>
             </w:r>
           </w:p>
           <w:p>

</xml_diff>

<commit_message>
feat(modeles): DPAO-T 6.3 (c) et (e) sur {{MOYENS.materiel}} / {{MOYENS.personnel}}, texte de B03 en complement (en attente de validation du pilote ; condition sur la liste demandee au backend) ; apercu aligne sur la livraison V60 (sigle)
Co-Authored-By: Claude Opus 5.5 (1M context) <noreply@anthropic.com>
</commit_message>
<xml_diff>
--- a/docs/modeles-dao/DPAO-T.docx
+++ b/docs/modeles-dao/DPAO-T.docx
@@ -1191,6 +1191,38 @@
               <w:rPr>
                 <w:sz w:val="20"/>
               </w:rPr>
+              <w:t>{{SI:MATERIEL-LISTE}}</w:t>
+            </w:r>
+          </w:p>
+          <w:p>
+            <w:r>
+              <w:rPr>
+                <w:sz w:val="20"/>
+              </w:rPr>
+              <w:t>{{MOYENS.materiel}}</w:t>
+            </w:r>
+          </w:p>
+          <w:p>
+            <w:r>
+              <w:rPr>
+                <w:sz w:val="20"/>
+              </w:rPr>
+              <w:t>{{FINSI:MATERIEL-LISTE}}</w:t>
+            </w:r>
+          </w:p>
+          <w:p>
+            <w:r>
+              <w:rPr>
+                <w:sz w:val="20"/>
+              </w:rPr>
+              <w:t>{{SI:MATERIEL-TEXTE}}</w:t>
+            </w:r>
+          </w:p>
+          <w:p>
+            <w:r>
+              <w:rPr>
+                <w:sz w:val="20"/>
+              </w:rPr>
               <w:t>{{B03-QT-09}}</w:t>
             </w:r>
           </w:p>
@@ -1199,6 +1231,14 @@
               <w:rPr>
                 <w:sz w:val="20"/>
               </w:rPr>
+              <w:t>{{FINSI:MATERIEL-TEXTE}}</w:t>
+            </w:r>
+          </w:p>
+          <w:p>
+            <w:r>
+              <w:rPr>
+                <w:sz w:val="20"/>
+              </w:rPr>
               <w:t>(d) proposer un directeur de travaux ayant {{B03-QT-10}} ans d’expérience dans la réalisation de travaux de nature et de complexité comparables;</w:t>
             </w:r>
           </w:p>
@@ -1215,7 +1255,7 @@
               <w:rPr>
                 <w:sz w:val="20"/>
               </w:rPr>
-              <w:t>(e) proposer le personnel clé suivant : {{B03-QT-13}}</w:t>
+              <w:t>(e) proposer le personnel clé suivant :</w:t>
             </w:r>
           </w:p>
           <w:p>
@@ -1224,6 +1264,54 @@
                 <w:sz w:val="20"/>
               </w:rPr>
               <w:t>{{FINSI:PERSONNEL-CLE}}</w:t>
+            </w:r>
+          </w:p>
+          <w:p>
+            <w:r>
+              <w:rPr>
+                <w:sz w:val="20"/>
+              </w:rPr>
+              <w:t>{{SI:PERSONNEL-LISTE}}</w:t>
+            </w:r>
+          </w:p>
+          <w:p>
+            <w:r>
+              <w:rPr>
+                <w:sz w:val="20"/>
+              </w:rPr>
+              <w:t>{{MOYENS.personnel}}</w:t>
+            </w:r>
+          </w:p>
+          <w:p>
+            <w:r>
+              <w:rPr>
+                <w:sz w:val="20"/>
+              </w:rPr>
+              <w:t>{{FINSI:PERSONNEL-LISTE}}</w:t>
+            </w:r>
+          </w:p>
+          <w:p>
+            <w:r>
+              <w:rPr>
+                <w:sz w:val="20"/>
+              </w:rPr>
+              <w:t>{{SI:PERSONNEL-TEXTE}}</w:t>
+            </w:r>
+          </w:p>
+          <w:p>
+            <w:r>
+              <w:rPr>
+                <w:sz w:val="20"/>
+              </w:rPr>
+              <w:t>{{B03-QT-13}}</w:t>
+            </w:r>
+          </w:p>
+          <w:p>
+            <w:r>
+              <w:rPr>
+                <w:sz w:val="20"/>
+              </w:rPr>
+              <w:t>{{FINSI:PERSONNEL-TEXTE}}</w:t>
             </w:r>
           </w:p>
           <w:p>

</xml_diff>

<commit_message>
feat(modeles): DPAO-T 6.2 1° et 2° sur {{PIECES.offre}} / {{PIECES.administratives}}, textes en complement (en attente de validation du pilote) ; apercu aligne sur V61 (« d'un mois »)
Co-Authored-By: Claude Opus 5.5 (1M context) <noreply@anthropic.com>
</commit_message>
<xml_diff>
--- a/docs/modeles-dao/DPAO-T.docx
+++ b/docs/modeles-dao/DPAO-T.docx
@@ -863,6 +863,38 @@
               <w:rPr>
                 <w:sz w:val="20"/>
               </w:rPr>
+              <w:t>{{SI:PIECES-OFFRE-LISTE}}</w:t>
+            </w:r>
+          </w:p>
+          <w:p>
+            <w:r>
+              <w:rPr>
+                <w:sz w:val="20"/>
+              </w:rPr>
+              <w:t>{{PIECES.offre}}</w:t>
+            </w:r>
+          </w:p>
+          <w:p>
+            <w:r>
+              <w:rPr>
+                <w:sz w:val="20"/>
+              </w:rPr>
+              <w:t>{{FINSI:PIECES-OFFRE-LISTE}}</w:t>
+            </w:r>
+          </w:p>
+          <w:p>
+            <w:r>
+              <w:rPr>
+                <w:sz w:val="20"/>
+              </w:rPr>
+              <w:t>{{SI:PIECES-OFFRE-TEXTE}}</w:t>
+            </w:r>
+          </w:p>
+          <w:p>
+            <w:r>
+              <w:rPr>
+                <w:sz w:val="20"/>
+              </w:rPr>
               <w:t>{{B04-PI-01}}</w:t>
             </w:r>
           </w:p>
@@ -871,6 +903,14 @@
               <w:rPr>
                 <w:sz w:val="20"/>
               </w:rPr>
+              <w:t>{{FINSI:PIECES-OFFRE-TEXTE}}</w:t>
+            </w:r>
+          </w:p>
+          <w:p>
+            <w:r>
+              <w:rPr>
+                <w:sz w:val="20"/>
+              </w:rPr>
               <w:t>2° -</w:t>
             </w:r>
           </w:p>
@@ -879,7 +919,47 @@
               <w:rPr>
                 <w:sz w:val="20"/>
               </w:rPr>
+              <w:t>{{SI:PIECES-ADM-LISTE}}</w:t>
+            </w:r>
+          </w:p>
+          <w:p>
+            <w:r>
+              <w:rPr>
+                <w:sz w:val="20"/>
+              </w:rPr>
+              <w:t>{{PIECES.administratives}}</w:t>
+            </w:r>
+          </w:p>
+          <w:p>
+            <w:r>
+              <w:rPr>
+                <w:sz w:val="20"/>
+              </w:rPr>
+              <w:t>{{FINSI:PIECES-ADM-LISTE}}</w:t>
+            </w:r>
+          </w:p>
+          <w:p>
+            <w:r>
+              <w:rPr>
+                <w:sz w:val="20"/>
+              </w:rPr>
+              <w:t>{{SI:PIECES-ADM-TEXTE}}</w:t>
+            </w:r>
+          </w:p>
+          <w:p>
+            <w:r>
+              <w:rPr>
+                <w:sz w:val="20"/>
+              </w:rPr>
               <w:t>{{B03-CQ-01}}</w:t>
+            </w:r>
+          </w:p>
+          <w:p>
+            <w:r>
+              <w:rPr>
+                <w:sz w:val="20"/>
+              </w:rPr>
+              <w:t>{{FINSI:PIECES-ADM-TEXTE}}</w:t>
             </w:r>
           </w:p>
           <w:p>

</xml_diff>